<commit_message>
Withdrawal letter: first-person apology opening; co-author named without titles
Co-Authored-By: Claude Fable 5 <noreply@anthropic.com>
Claude-Session: https://claude.ai/code/session_01KoT3i8geZspYBMMKVYJUTG
</commit_message>
<xml_diff>
--- a/docs/papers/publication/Withdrawal_Letter_AllAuthors_JMIR_ms111728_SHORT_FINAL.docx
+++ b/docs/papers/publication/Withdrawal_Letter_AllAuthors_JMIR_ms111728_SHORT_FINAL.docx
@@ -60,7 +60,7 @@
           <w:sz w:val="24"/>
           <w:szCs w:val="24"/>
         </w:rPr>
-        <w:t xml:space="preserve">We formally request the withdrawal of manuscript #111728, “Gamification as a Proactive Approach: A Study of Elderly Failure-Induced Abandonment in Gamified Fall Risk Assessment.” A withdrawal request was posted through the Communication Log shortly after submission, before initial editorial checks were complete; this letter, signed by both authors, confirms it.</w:t>
+        <w:t xml:space="preserve">I sincerely apologise for the error described in this letter, and I respectfully request the withdrawal of manuscript #111728, “Gamification as a Proactive Approach: A Study of Elderly Failure-Induced Abandonment in Gamified Fall Risk Assessment.” A withdrawal request was posted through the Communication Log shortly after submission, before initial editorial checks were complete; this letter, signed by both authors, confirms it.</w:t>
       </w:r>
     </w:p>
     <w:p>
@@ -74,7 +74,7 @@
           <w:sz w:val="24"/>
           <w:szCs w:val="24"/>
         </w:rPr>
-        <w:t xml:space="preserve">The manuscript was already under consideration at another publisher’s journal when it was submitted to JMIR Serious Games, so the declaration that it was not under consideration elsewhere was not accurate. The submission was made by the corresponding author without the supervisor’s consent and — this being his first journal submission — in oversight of the rule that a manuscript may be under consideration at only one journal at a time. On learning of the submission, the supervising co-author required its immediate withdrawal; this signed letter gives effect to that, before any editorial review. The manuscript remains under consideration at one journal only.</w:t>
+        <w:t xml:space="preserve">The manuscript was already under consideration at another publisher’s journal when I submitted it to JMIR Serious Games, so the declaration that it was not under consideration elsewhere was not accurate. I made the submission without my co-author’s consent and — this being my first journal submission — in oversight of the rule that a manuscript may be under consideration at only one journal at a time. On learning of the submission, my co-author required its immediate withdrawal; this signed letter gives effect to that, before any editorial review. The manuscript remains under consideration at one journal only.</w:t>
       </w:r>
     </w:p>
     <w:p>
@@ -88,7 +88,7 @@
           <w:sz w:val="24"/>
           <w:szCs w:val="24"/>
         </w:rPr>
-        <w:t xml:space="preserve">We apologise sincerely for the editorial time this error consumed and hope the editorial team can understand how the mistake arose. The corresponding author now fully understands the ethical constraint against duplicate submission and will not make a similar mistake again. We would be grateful for your confirmation once the withdrawal is effective.</w:t>
+        <w:t xml:space="preserve">The mistake is mine alone. I now fully understand the ethical constraint against duplicate submission and will not make a similar mistake again. I humbly ask for the editorial team’s understanding, apologise for the editorial time my error consumed, and would be grateful for your confirmation once the withdrawal is effective.</w:t>
       </w:r>
     </w:p>
     <w:p>
@@ -210,7 +210,7 @@
                 <w:sz w:val="24"/>
                 <w:szCs w:val="24"/>
               </w:rPr>
-              <w:t xml:space="preserve">Prof. Chi Fai Cheung</w:t>
+              <w:t xml:space="preserve">Cheung Chi Fai</w:t>
             </w:r>
           </w:p>
           <w:p>

</xml_diff>